<commit_message>
Fix CV defects found in review: internal filename leak, ATS heading, availability
- Remove the "siehe lernplan.md" reference from the skills section: it pointed
  at a repository file that no recruiter can open
- Rename the skills heading to a standard token ("Kenntnisse & Fähigkeiten") so
  resume parsers classify the section instead of dropping it
- Separate skill lists with commas rather than middots, which parsers do not
  treat as a delimiter
- Add availability (hours per week, start date) to the CV header and cover
  letter closing - a standard expectation for a working-student application

Co-Authored-By: Claude Opus 5 <noreply@anthropic.com>
Claude-Session: https://claude.ai/code/session_01FU9RUXkiipMM9QnkLyeQPz
</commit_message>
<xml_diff>
--- a/output/Lebenslauf_PwC_QA.docx
+++ b/output/Lebenslauf_PwC_QA.docx
@@ -68,6 +68,14 @@
     </w:p>
     <w:p>
       <w:pPr>
+        <w:spacing w:after="0"/>
+      </w:pPr>
+      <w:r>
+        <w:t>Verfügbarkeit: {{STUNDEN}} Stunden/Woche ab {{STARTDATUM}}</w:t>
+      </w:r>
+    </w:p>
+    <w:p>
+      <w:pPr>
         <w:spacing w:before="120"/>
       </w:pPr>
       <w:r>
@@ -96,7 +104,7 @@
     </w:p>
     <w:p>
       <w:r>
-        <w:t>Werkstudent in der Software-Qualitätssicherung mit Praxis in Produktabnahme, manuellem Testing und strukturierter Fehler- und Testdokumentation – im agilen Umfeld, in Sprints und mit Azure DevOps (Test Plans, Boards, Repos) als Testmanagement- und Tracking-Umgebung. Studium des Wirtschaftsingenieurwesens an der HTW Berlin mit abgeschlossener kaufmännischer Ausbildung – dadurch die Brücke zwischen Business, Technologie und Beratung, wie sie in cross-funktionalen Teams gebraucht wird. Ausgeprägte Detailorientierung, systematisches Denken in Edge Cases und Ausnahmefällen sowie klares, nachvollziehbares Fehlerreporting. Testautomatisierung (Selenium, Cypress, JUnit) sowie API- und Performance-Tests werden aktuell im Selbststudium aufgebaut (Details siehe Abschnitt „In Aneignung“).</w:t>
+        <w:t>Werkstudent in der Software-Qualitätssicherung mit Praxis in Produktabnahme, manuellem Testing und strukturierter Fehler- und Testdokumentation – im agilen Umfeld, in Sprints und mit Azure DevOps (Test Plans, Boards, Repos) als Testmanagement- und Tracking-Umgebung. Studium des Wirtschaftsingenieurwesens an der HTW Berlin mit abgeschlossener kaufmännischer Ausbildung – dadurch die Brücke zwischen Business, Technologie und Beratung, wie sie in cross-funktionalen Teams gebraucht wird. Ausgeprägte Detailorientierung, systematisches Denken in Edge Cases und Ausnahmefällen sowie klares, nachvollziehbares Fehlerreporting. Testautomatisierung (Selenium, Cypress, JUnit) sowie API- und Performance-Tests werden aktuell im Selbststudium aufgebaut (Details siehe Abschnitt „Kenntnisse &amp; Fähigkeiten“).</w:t>
       </w:r>
     </w:p>
     <w:p>
@@ -112,17 +120,17 @@
           <w:color w:val="1F3B57"/>
           <w:sz w:val="24"/>
         </w:rPr>
-        <w:t>QUALITÄTSSICHERUNG &amp; TESTING – KERNKOMPETENZEN</w:t>
+        <w:t>KENNTNISSE &amp; FÄHIGKEITEN – QUALITÄTSSICHERUNG UND TESTING</w:t>
       </w:r>
     </w:p>
     <w:p>
       <w:r>
-        <w:t>Praxiserprobt: Manuelles Testing &amp; Produktabnahme · Testfallentwurf und Testdurchführung · Edge-Case-/Ausnahmefall-Analyse („Unlucky Paths“) · Fehlererfassung, Priorisierung, Nachverfolgung und Retest · Testmanagement mit Azure DevOps (Test Plans, Boards, Work Items) · Agiles Arbeiten in Sprints (Scrum) · Versionskontrolle mit Git / Azure Repos · Test- und Projektdokumentation · Abstimmung mit Entwicklungs- und Fachteams</w:t>
+        <w:t>Praxiserprobt: Manuelles Testing &amp; Produktabnahme, Testfallentwurf und Testdurchführung, Edge-Case-/Ausnahmefall-Analyse („Unlucky Paths“), Fehlererfassung, Priorisierung, Nachverfolgung und Retest, Testmanagement mit Azure DevOps (Test Plans, Boards, Work Items), Agiles Arbeiten in Sprints (Scrum), Versionskontrolle mit Git / Azure Repos, Test- und Projektdokumentation, Abstimmung mit Entwicklungs- und Fachteams</w:t>
       </w:r>
     </w:p>
     <w:p>
       <w:r>
-        <w:t>In Aneignung (Selbststudium, siehe lernplan.md): Testautomatisierung: Selenium, Cypress, JUnit · API-Tests (Postman/REST), Performance- und Sicherheitstests (Grundlagen) · Jira und TestRail (Umstieg von Azure DevOps, Grundlagen) · Testen von KI-Modellen und datengetriebenen Systemen (Grundlagen)</w:t>
+        <w:t>Im Aufbau (Selbststudium): Testautomatisierung: Selenium, Cypress, JUnit, API-Tests (Postman/REST), Performance- und Sicherheitstests (Grundlagen), Jira und TestRail (Umstieg von Azure DevOps, Grundlagen), Testen von KI-Modellen und datengetriebenen Systemen (Grundlagen)</w:t>
       </w:r>
     </w:p>
     <w:p>
@@ -457,12 +465,12 @@
     </w:p>
     <w:p>
       <w:r>
-        <w:t>Sicher: Azure DevOps (Test Plans, Boards, Repos) · Git · MS Excel · MS PowerPoint · MS Word · SAP · Asana · CRM (Pipedrive, Zoho)</w:t>
+        <w:t>Sicher: Azure DevOps (Test Plans, Boards, Repos), Git, MS Excel, MS PowerPoint, MS Word, SAP, Asana, CRM (Pipedrive, Zoho)</w:t>
       </w:r>
     </w:p>
     <w:p>
       <w:r>
-        <w:t>Grundkenntnisse: Python · SQL · C#</w:t>
+        <w:t>Grundkenntnisse: Python, SQL, C#</w:t>
       </w:r>
     </w:p>
     <w:p>

</xml_diff>

<commit_message>
Add test-plan ownership and product-management collaboration
The applicant creates test plans together with the product manager. This
evidences the posting's test-planning requirement and its "close cooperation
with development and product teams" directly, so it leads the AKG entry and
appears in the profile and cover letter. Align the analysis doc with the
renamed skills block.

Co-Authored-By: Claude Opus 5 <noreply@anthropic.com>
Claude-Session: https://claude.ai/code/session_01FU9RUXkiipMM9QnkLyeQPz
</commit_message>
<xml_diff>
--- a/output/Lebenslauf_PwC_QA.docx
+++ b/output/Lebenslauf_PwC_QA.docx
@@ -104,7 +104,7 @@
     </w:p>
     <w:p>
       <w:r>
-        <w:t>Werkstudent in der Software-Qualitätssicherung mit Praxis in Produktabnahme, manuellem Testing und strukturierter Fehler- und Testdokumentation – im agilen Umfeld, in Sprints und mit Azure DevOps (Test Plans, Boards, Repos) als Testmanagement- und Tracking-Umgebung. Studium des Wirtschaftsingenieurwesens an der HTW Berlin mit abgeschlossener kaufmännischer Ausbildung – dadurch die Brücke zwischen Business, Technologie und Beratung, wie sie in cross-funktionalen Teams gebraucht wird. Ausgeprägte Detailorientierung, systematisches Denken in Edge Cases und Ausnahmefällen sowie klares, nachvollziehbares Fehlerreporting. Testautomatisierung (Selenium, Cypress, JUnit) sowie API- und Performance-Tests werden aktuell im Selbststudium aufgebaut (Details siehe Abschnitt „Kenntnisse &amp; Fähigkeiten“).</w:t>
+        <w:t>Werkstudent in der Software-Qualitätssicherung mit Praxis in Testplanung, Produktabnahme, manuellem Testing und strukturierter Fehler- und Testdokumentation. Erstellung von Testplänen in enger Zusammenarbeit mit dem Produktmanagement – im agilen Umfeld, in Sprints und mit Azure DevOps (Test Plans, Boards, Repos) als Testmanagement- und Tracking-Umgebung. Studium des Wirtschaftsingenieurwesens an der HTW Berlin mit abgeschlossener kaufmännischer Ausbildung – dadurch die Brücke zwischen Business, Technologie und Beratung, wie sie in cross-funktionalen Teams gebraucht wird. Ausgeprägte Detailorientierung, systematisches Denken in Edge Cases und Ausnahmefällen sowie klares, nachvollziehbares Fehlerreporting. Testautomatisierung (Selenium, Cypress, JUnit) sowie API- und Performance-Tests werden aktuell im Selbststudium aufgebaut (Details siehe Abschnitt „Kenntnisse &amp; Fähigkeiten“).</w:t>
       </w:r>
     </w:p>
     <w:p>
@@ -125,7 +125,7 @@
     </w:p>
     <w:p>
       <w:r>
-        <w:t>Praxiserprobt: Manuelles Testing &amp; Produktabnahme, Testfallentwurf und Testdurchführung, Edge-Case-/Ausnahmefall-Analyse („Unlucky Paths“), Fehlererfassung, Priorisierung, Nachverfolgung und Retest, Testmanagement mit Azure DevOps (Test Plans, Boards, Work Items), Agiles Arbeiten in Sprints (Scrum), Versionskontrolle mit Git / Azure Repos, Test- und Projektdokumentation, Abstimmung mit Entwicklungs- und Fachteams</w:t>
+        <w:t>Praxiserprobt: Testplanung und Testkonzeption, Manuelles Testing &amp; Produktabnahme, Testfallentwurf und Testdurchführung, Edge-Case-/Ausnahmefall-Analyse („Unlucky Paths“), Fehlererfassung, Priorisierung, Nachverfolgung und Retest, Testmanagement mit Azure DevOps (Test Plans, Boards, Work Items), Agiles Arbeiten in Sprints (Scrum), Versionskontrolle mit Git / Azure Repos, Test- und Projektdokumentation, Zusammenarbeit mit Entwicklungs- und Produktteams</w:t>
       </w:r>
     </w:p>
     <w:p>
@@ -178,6 +178,15 @@
         <w:spacing w:after="20"/>
       </w:pPr>
       <w:r>
+        <w:t>Erstellung von Testplänen in enger Zusammenarbeit mit dem Produktmanagement – Ableitung von Testumfang, Testszenarien und Abnahmekriterien aus den Produktanforderungen</w:t>
+      </w:r>
+    </w:p>
+    <w:p>
+      <w:pPr>
+        <w:pStyle w:val="ListBullet"/>
+        <w:spacing w:after="20"/>
+      </w:pPr>
+      <w:r>
         <w:t>Planung und Durchführung manueller Softwaretests in der Produktabnahme – von Testfallentwurf über Ausführung bis zur Abnahmeempfehlung; Verwaltung der Testfälle und Testläufe in Azure DevOps Test Plans</w:t>
       </w:r>
     </w:p>
@@ -214,16 +223,7 @@
         <w:spacing w:after="20"/>
       </w:pPr>
       <w:r>
-        <w:t>Arbeit im agilen Umfeld in Sprints – Abstimmung von Testumfang und Abnahmekriterien entlang des Sprint-Zyklus</w:t>
-      </w:r>
-    </w:p>
-    <w:p>
-      <w:pPr>
-        <w:pStyle w:val="ListBullet"/>
-        <w:spacing w:after="20"/>
-      </w:pPr>
-      <w:r>
-        <w:t>Enge teamübergreifende Abstimmung mit Entwicklung und Fachbereich zu Anforderungen, Fehlerbildern und Abnahmekriterien</w:t>
+        <w:t>Arbeit im agilen Umfeld in Sprints – enge teamübergreifende Abstimmung mit Entwicklungs- und Produktteams zu Anforderungen, Fehlerbildern und Abnahmekriterien entlang des Sprint-Zyklus</w:t>
       </w:r>
     </w:p>
     <w:p>

</xml_diff>